<commit_message>
Refactor the code organization
</commit_message>
<xml_diff>
--- a/Practice-1/result/23640731_Nguyễn Nam Trung Nguyên.docx
+++ b/Practice-1/result/23640731_Nguyễn Nam Trung Nguyên.docx
@@ -52,7 +52,7 @@
           <w:color w:val="000000"/>
           <w:szCs w:val="26"/>
         </w:rPr>
-        <w:br/>
+        <w:t xml:space="preserve"> </w:t>
       </w:r>
       <w:r>
         <w:rPr>
@@ -504,28 +504,28 @@
           <w:sz w:val="26"/>
           <w:szCs w:val="26"/>
         </w:rPr>
+        <w:t>22. Create a class Stack with push, pop, peek, isEmpty methods.</w:t>
+      </w:r>
+      <w:r>
+        <w:rPr>
+          <w:rFonts w:cs="Times New Roman"/>
+          <w:b/>
+          <w:bCs/>
+          <w:color w:val="000000"/>
+          <w:szCs w:val="26"/>
+        </w:rPr>
+        <w:br/>
+      </w:r>
+      <w:r>
+        <w:rPr>
+          <w:rStyle w:val="fontstyle01"/>
+          <w:rFonts w:ascii="Times New Roman" w:hAnsi="Times New Roman" w:cs="Times New Roman"/>
+          <w:b/>
+          <w:bCs/>
+          <w:sz w:val="26"/>
+          <w:szCs w:val="26"/>
+        </w:rPr>
         <w:lastRenderedPageBreak/>
-        <w:t>22. Create a class Stack with push, pop, peek, isEmpty methods.</w:t>
-      </w:r>
-      <w:r>
-        <w:rPr>
-          <w:rFonts w:cs="Times New Roman"/>
-          <w:b/>
-          <w:bCs/>
-          <w:color w:val="000000"/>
-          <w:szCs w:val="26"/>
-        </w:rPr>
-        <w:br/>
-      </w:r>
-      <w:r>
-        <w:rPr>
-          <w:rStyle w:val="fontstyle01"/>
-          <w:rFonts w:ascii="Times New Roman" w:hAnsi="Times New Roman" w:cs="Times New Roman"/>
-          <w:b/>
-          <w:bCs/>
-          <w:sz w:val="26"/>
-          <w:szCs w:val="26"/>
-        </w:rPr>
         <w:t>23. Create an interface Payment with method pay(amount). Implement CashPayment and</w:t>
       </w:r>
       <w:r>

</xml_diff>